<commit_message>
L esborrany a l Adria, mes curt
De 29 blocs a 17: fora la taula del /100 i la de la comparativa -les xifres
van en linia-, i la resta comprimida. Les cinc peticions es mantenen: el
discount per confirmar, que no hi posi el REPLACE del DESHABILITAT__, els
documents de 100+ linies, i magatzem i previsions.

Co-Authored-By: Claude Opus 5 (1M context) <noreply@anthropic.com>
</commit_message>
<xml_diff>
--- a/resposta_adria_5.docx
+++ b/resposta_adria_5.docx
@@ -17,7 +17,7 @@
           <w:b w:val="0"/>
           <w:i w:val="0"/>
         </w:rPr>
-        <w:t xml:space="preserve">Gràcies, i especialment pel </w:t>
+        <w:t xml:space="preserve">Gràcies, i sobretot pel </w:t>
       </w:r>
       <w:r>
         <w:rPr>
@@ -34,33 +34,21 @@
           <w:b w:val="0"/>
           <w:i w:val="0"/>
         </w:rPr>
-        <w:t xml:space="preserve">: amb el teu correu ja el tinc </w:t>
+        <w:t xml:space="preserve">: amb el teu correu ja el tinc tancat per escrit, que era l'únic punt que el dia del tall podia fallar sense que cap validació ho veiés. Us els enviem </w:t>
       </w:r>
       <w:r>
         <w:rPr>
           <w:b/>
           <w:i w:val="0"/>
         </w:rPr>
-        <w:t>tancat per escrit</w:t>
+        <w:t>en euros</w:t>
       </w:r>
       <w:r>
         <w:rPr>
           <w:b w:val="0"/>
           <w:i w:val="0"/>
         </w:rPr>
-        <w:t>, que era l'únic punt de tot el projecte que el dia del tall podia fallar sense que cap validació ho veiés.</w:t>
-      </w:r>
-    </w:p>
-    <w:p>
-      <w:pPr>
-        <w:pStyle w:val="Heading2"/>
-      </w:pPr>
-      <w:r>
-        <w:rPr>
-          <w:b w:val="0"/>
-          <w:i w:val="0"/>
-        </w:rPr>
-        <w:t xml:space="preserve">El </w:t>
+        <w:t xml:space="preserve">, el </w:t>
       </w:r>
       <w:r>
         <w:rPr>
@@ -77,171 +65,23 @@
           <w:b w:val="0"/>
           <w:i w:val="0"/>
         </w:rPr>
-        <w:t>: entesos, i no toquem res</w:t>
+        <w:t xml:space="preserve"> el treus tu, i </w:t>
       </w:r>
-    </w:p>
-    <w:p>
+      <w:r>
+        <w:rPr>
+          <w:b/>
+          <w:i w:val="0"/>
+        </w:rPr>
+        <w:t>nosaltres no multipliquem per 100</w:t>
+      </w:r>
       <w:r>
         <w:rPr>
           <w:b w:val="0"/>
           <w:i w:val="0"/>
         </w:rPr>
-        <w:t>Queda així, i ho deixo escrit perquè el dia 2 no s'hagi de recordar de memòria:</w:t>
+        <w:t xml:space="preserve"> — si ho féssim tots dos, tornaria a desquadrar.</w:t>
       </w:r>
     </w:p>
-    <w:tbl>
-      <w:tblPr>
-        <w:tblStyle w:val="LightGrid-Accent1"/>
-        <w:tblW w:type="auto" w:w="0"/>
-        <w:tblLook w:firstColumn="1" w:firstRow="1" w:lastColumn="0" w:lastRow="0" w:noHBand="0" w:noVBand="1" w:val="04A0"/>
-      </w:tblPr>
-      <w:tblGrid>
-        <w:gridCol w:w="4320"/>
-        <w:gridCol w:w="4320"/>
-      </w:tblGrid>
-      <w:tr>
-        <w:tc>
-          <w:tcPr>
-            <w:tcW w:type="dxa" w:w="4320"/>
-          </w:tcPr>
-          <w:p>
-            <w:r>
-              <w:rPr>
-                <w:rFonts w:ascii="Consolas" w:hAnsi="Consolas"/>
-                <w:b/>
-                <w:i w:val="0"/>
-                <w:color w:val="333333"/>
-                <w:sz w:val="20"/>
-              </w:rPr>
-              <w:t>product_price</w:t>
-            </w:r>
-            <w:r>
-              <w:rPr>
-                <w:b/>
-                <w:i w:val="0"/>
-              </w:rPr>
-              <w:t xml:space="preserve"> i </w:t>
-            </w:r>
-            <w:r>
-              <w:rPr>
-                <w:rFonts w:ascii="Consolas" w:hAnsi="Consolas"/>
-                <w:b/>
-                <w:i w:val="0"/>
-                <w:color w:val="333333"/>
-                <w:sz w:val="20"/>
-              </w:rPr>
-              <w:t>product_cost</w:t>
-            </w:r>
-          </w:p>
-        </w:tc>
-        <w:tc>
-          <w:tcPr>
-            <w:tcW w:type="dxa" w:w="4320"/>
-          </w:tcPr>
-          <w:p>
-            <w:r>
-              <w:rPr>
-                <w:b/>
-                <w:i w:val="0"/>
-              </w:rPr>
-              <w:t>Us els enviem en euros</w:t>
-            </w:r>
-            <w:r>
-              <w:rPr>
-                <w:b/>
-                <w:i w:val="0"/>
-              </w:rPr>
-              <w:t>, com fins ara</w:t>
-            </w:r>
-          </w:p>
-        </w:tc>
-      </w:tr>
-      <w:tr>
-        <w:tc>
-          <w:tcPr>
-            <w:tcW w:type="dxa" w:w="4320"/>
-          </w:tcPr>
-          <w:p>
-            <w:r>
-              <w:rPr>
-                <w:b w:val="0"/>
-                <w:i w:val="0"/>
-              </w:rPr>
-              <w:t xml:space="preserve">El </w:t>
-            </w:r>
-            <w:r>
-              <w:rPr>
-                <w:rFonts w:ascii="Consolas" w:hAnsi="Consolas"/>
-                <w:b w:val="0"/>
-                <w:i w:val="0"/>
-                <w:color w:val="333333"/>
-                <w:sz w:val="20"/>
-              </w:rPr>
-              <w:t>/100</w:t>
-            </w:r>
-          </w:p>
-        </w:tc>
-        <w:tc>
-          <w:tcPr>
-            <w:tcW w:type="dxa" w:w="4320"/>
-          </w:tcPr>
-          <w:p>
-            <w:r>
-              <w:rPr>
-                <w:b/>
-                <w:i w:val="0"/>
-              </w:rPr>
-              <w:t>El treus tu</w:t>
-            </w:r>
-            <w:r>
-              <w:rPr>
-                <w:b w:val="0"/>
-                <w:i w:val="0"/>
-              </w:rPr>
-              <w:t>, amb el canvi que ja tens provat</w:t>
-            </w:r>
-          </w:p>
-        </w:tc>
-      </w:tr>
-      <w:tr>
-        <w:tc>
-          <w:tcPr>
-            <w:tcW w:type="dxa" w:w="4320"/>
-          </w:tcPr>
-          <w:p>
-            <w:r>
-              <w:rPr>
-                <w:b w:val="0"/>
-                <w:i w:val="0"/>
-              </w:rPr>
-              <w:t>Nosaltres</w:t>
-            </w:r>
-          </w:p>
-        </w:tc>
-        <w:tc>
-          <w:tcPr>
-            <w:tcW w:type="dxa" w:w="4320"/>
-          </w:tcPr>
-          <w:p>
-            <w:r>
-              <w:rPr>
-                <w:b/>
-                <w:i w:val="0"/>
-              </w:rPr>
-              <w:t>No multipliquem per 100.</w:t>
-            </w:r>
-            <w:r>
-              <w:rPr>
-                <w:b w:val="0"/>
-                <w:i w:val="0"/>
-              </w:rPr>
-              <w:t xml:space="preserve"> Si ho féssim tots dos alhora, tornaria a desquadrar</w:t>
-            </w:r>
-          </w:p>
-        </w:tc>
-      </w:tr>
-    </w:tbl>
-    <w:p/>
     <w:p>
       <w:r>
         <w:rPr>
@@ -255,7 +95,7 @@
           <w:b/>
           <w:i w:val="0"/>
         </w:rPr>
-        <w:t xml:space="preserve">Una cosa que no esmentes i que et vull fer confirmar: el </w:t>
+        <w:t xml:space="preserve">Del </w:t>
       </w:r>
       <w:r>
         <w:rPr>
@@ -272,26 +112,19 @@
           <w:b/>
           <w:i w:val="0"/>
         </w:rPr>
-        <w:t>.</w:t>
+        <w:t xml:space="preserve"> no dius res, i t'ho vull fer confirmar.</w:t>
       </w:r>
       <w:r>
         <w:rPr>
           <w:b w:val="0"/>
           <w:i w:val="0"/>
         </w:rPr>
-        <w:t xml:space="preserve"> Al teu llistat de canvis no hi surt, i per tant entenc que </w:t>
-      </w:r>
-      <w:r>
-        <w:rPr>
-          <w:b/>
-          <w:i w:val="0"/>
-        </w:rPr>
-        <w:t xml:space="preserve">mantens el teu </w:t>
+        <w:t xml:space="preserve"> Entenc que mantens el teu </w:t>
       </w:r>
       <w:r>
         <w:rPr>
           <w:rFonts w:ascii="Consolas" w:hAnsi="Consolas"/>
-          <w:b/>
+          <w:b w:val="0"/>
           <w:i w:val="0"/>
           <w:color w:val="333333"/>
           <w:sz w:val="20"/>
@@ -303,7 +136,7 @@
           <w:b w:val="0"/>
           <w:i w:val="0"/>
         </w:rPr>
-        <w:t xml:space="preserve"> i nosaltres seguim enviant-vos el multiplicador de KAIS (</w:t>
+        <w:t xml:space="preserve"> i que seguim enviant-vos el multiplicador de KAIS (</w:t>
       </w:r>
       <w:r>
         <w:rPr>
@@ -337,7 +170,7 @@
           <w:b w:val="0"/>
           <w:i w:val="0"/>
         </w:rPr>
-        <w:t xml:space="preserve"> = 10 % de descompte). Nosaltres ho tenim preparat per normalitzar-ho el dia que vulguis, però </w:t>
+        <w:t xml:space="preserve"> = 10 % de descompte). Ho tenim preparat per normalitzar-ho el dia que vulguis, però </w:t>
       </w:r>
       <w:r>
         <w:rPr>
@@ -377,7 +210,7 @@
           <w:b w:val="0"/>
           <w:i w:val="0"/>
         </w:rPr>
-        <w:t xml:space="preserve">I del filtre </w:t>
+        <w:t xml:space="preserve">Del filtre </w:t>
       </w:r>
       <w:r>
         <w:rPr>
@@ -394,40 +227,28 @@
           <w:b w:val="0"/>
           <w:i w:val="0"/>
         </w:rPr>
-        <w:t>: entesos. Vol dir que tot el que publiquem abans del tall us és invisible, cosa que em va bé —la SAP de producció arrenca sense històric documental—, i també que el cost d'octubre deixa de ser un problema.</w:t>
+        <w:t>, entesos.</w:t>
       </w:r>
     </w:p>
     <w:p>
-      <w:pPr>
-        <w:pStyle w:val="Heading2"/>
-      </w:pPr>
+      <w:r>
+        <w:rPr>
+          <w:b/>
+          <w:i w:val="0"/>
+        </w:rPr>
+        <w:t>Les ubicacions:</w:t>
+      </w:r>
       <w:r>
         <w:rPr>
           <w:b w:val="0"/>
           <w:i w:val="0"/>
         </w:rPr>
-        <w:t>Les ubicacions: perfecte, i gràcies per dir-ho</w:t>
-      </w:r>
-    </w:p>
-    <w:p>
-      <w:r>
-        <w:rPr>
-          <w:b w:val="0"/>
-          <w:i w:val="0"/>
-        </w:rPr>
-        <w:t xml:space="preserve">Si encara no heu importat res a producció i el dia del canvi feu el swap amb les SQL noves, </w:t>
-      </w:r>
-      <w:r>
-        <w:rPr>
-          <w:b/>
-          <w:i w:val="0"/>
-        </w:rPr>
-        <w:t xml:space="preserve">el mapatge </w:t>
+        <w:t xml:space="preserve"> si encara no heu importat res a producció, el mapatge </w:t>
       </w:r>
       <w:r>
         <w:rPr>
           <w:rFonts w:ascii="Consolas" w:hAnsi="Consolas"/>
-          <w:b/>
+          <w:b w:val="0"/>
           <w:i w:val="0"/>
           <w:color w:val="333333"/>
           <w:sz w:val="20"/>
@@ -436,292 +257,77 @@
       </w:r>
       <w:r>
         <w:rPr>
+          <w:b w:val="0"/>
+          <w:i w:val="0"/>
+        </w:rPr>
+        <w:t xml:space="preserve"> no el necessiteu i no t'empipo més. El tinc guardat; si mai fa falta, demana-me'l.</w:t>
+      </w:r>
+    </w:p>
+    <w:p>
+      <w:r>
+        <w:rPr>
           <w:b/>
           <w:i w:val="0"/>
         </w:rPr>
-        <w:t xml:space="preserve"> no el necessiteu</w:t>
+        <w:t>La comparativa es veu millor</w:t>
       </w:r>
       <w:r>
         <w:rPr>
           <w:b w:val="0"/>
           <w:i w:val="0"/>
         </w:rPr>
-        <w:t xml:space="preserve"> i ja no t'empipo més amb això. El tinc guardat de totes maneres: si en algun moment us fa falta, demana-me'l i te'l passo.</w:t>
+        <w:t xml:space="preserve"> on havia de millorar: </w:t>
       </w:r>
-    </w:p>
-    <w:p>
-      <w:pPr>
-        <w:pStyle w:val="Heading2"/>
-      </w:pPr>
+      <w:r>
+        <w:rPr>
+          <w:rFonts w:ascii="Consolas" w:hAnsi="Consolas"/>
+          <w:b w:val="0"/>
+          <w:i w:val="0"/>
+          <w:color w:val="333333"/>
+          <w:sz w:val="20"/>
+        </w:rPr>
+        <w:t>address</w:t>
+      </w:r>
       <w:r>
         <w:rPr>
           <w:b w:val="0"/>
           <w:i w:val="0"/>
         </w:rPr>
-        <w:t>La comparativa nova: la correcció es veu</w:t>
+        <w:t xml:space="preserve"> 1.279 → 651, </w:t>
       </w:r>
-    </w:p>
-    <w:p>
+      <w:r>
+        <w:rPr>
+          <w:rFonts w:ascii="Consolas" w:hAnsi="Consolas"/>
+          <w:b w:val="0"/>
+          <w:i w:val="0"/>
+          <w:color w:val="333333"/>
+          <w:sz w:val="20"/>
+        </w:rPr>
+        <w:t>zip_code</w:t>
+      </w:r>
       <w:r>
         <w:rPr>
           <w:b w:val="0"/>
           <w:i w:val="0"/>
         </w:rPr>
-        <w:t>Comparant les teves dues comparatives, les columnes d'adreça s'han ensorrat, que és exactament on havia de notar-se:</w:t>
+        <w:t xml:space="preserve"> 673 → 26, </w:t>
       </w:r>
-    </w:p>
-    <w:tbl>
-      <w:tblPr>
-        <w:tblStyle w:val="LightGrid-Accent1"/>
-        <w:tblW w:type="auto" w:w="0"/>
-        <w:tblLook w:firstColumn="1" w:firstRow="1" w:lastColumn="0" w:lastRow="0" w:noHBand="0" w:noVBand="1" w:val="04A0"/>
-      </w:tblPr>
-      <w:tblGrid>
-        <w:gridCol w:w="2880"/>
-        <w:gridCol w:w="2880"/>
-        <w:gridCol w:w="2880"/>
-      </w:tblGrid>
-      <w:tr>
-        <w:tc>
-          <w:tcPr>
-            <w:tcW w:type="dxa" w:w="2880"/>
-          </w:tcPr>
-          <w:p>
-            <w:r>
-              <w:rPr>
-                <w:b/>
-                <w:i w:val="0"/>
-              </w:rPr>
-              <w:t>Columna</w:t>
-            </w:r>
-          </w:p>
-        </w:tc>
-        <w:tc>
-          <w:tcPr>
-            <w:tcW w:type="dxa" w:w="2880"/>
-          </w:tcPr>
-          <w:p>
-            <w:r>
-              <w:rPr>
-                <w:b/>
-                <w:i w:val="0"/>
-              </w:rPr>
-              <w:t>25 de setembre</w:t>
-            </w:r>
-          </w:p>
-        </w:tc>
-        <w:tc>
-          <w:tcPr>
-            <w:tcW w:type="dxa" w:w="2880"/>
-          </w:tcPr>
-          <w:p>
-            <w:r>
-              <w:rPr>
-                <w:b/>
-                <w:i w:val="0"/>
-              </w:rPr>
-              <w:t>5 d'octubre</w:t>
-            </w:r>
-          </w:p>
-        </w:tc>
-      </w:tr>
-      <w:tr>
-        <w:tc>
-          <w:tcPr>
-            <w:tcW w:type="dxa" w:w="2880"/>
-          </w:tcPr>
-          <w:p>
-            <w:r>
-              <w:rPr>
-                <w:rFonts w:ascii="Consolas" w:hAnsi="Consolas"/>
-                <w:b w:val="0"/>
-                <w:i w:val="0"/>
-                <w:color w:val="333333"/>
-                <w:sz w:val="20"/>
-              </w:rPr>
-              <w:t>address</w:t>
-            </w:r>
-          </w:p>
-        </w:tc>
-        <w:tc>
-          <w:tcPr>
-            <w:tcW w:type="dxa" w:w="2880"/>
-          </w:tcPr>
-          <w:p>
-            <w:r>
-              <w:rPr>
-                <w:b w:val="0"/>
-                <w:i w:val="0"/>
-              </w:rPr>
-              <w:t>1.279</w:t>
-            </w:r>
-          </w:p>
-        </w:tc>
-        <w:tc>
-          <w:tcPr>
-            <w:tcW w:type="dxa" w:w="2880"/>
-          </w:tcPr>
-          <w:p>
-            <w:r>
-              <w:rPr>
-                <w:b/>
-                <w:i w:val="0"/>
-              </w:rPr>
-              <w:t>651</w:t>
-            </w:r>
-          </w:p>
-        </w:tc>
-      </w:tr>
-      <w:tr>
-        <w:tc>
-          <w:tcPr>
-            <w:tcW w:type="dxa" w:w="2880"/>
-          </w:tcPr>
-          <w:p>
-            <w:r>
-              <w:rPr>
-                <w:rFonts w:ascii="Consolas" w:hAnsi="Consolas"/>
-                <w:b w:val="0"/>
-                <w:i w:val="0"/>
-                <w:color w:val="333333"/>
-                <w:sz w:val="20"/>
-              </w:rPr>
-              <w:t>zip_code</w:t>
-            </w:r>
-          </w:p>
-        </w:tc>
-        <w:tc>
-          <w:tcPr>
-            <w:tcW w:type="dxa" w:w="2880"/>
-          </w:tcPr>
-          <w:p>
-            <w:r>
-              <w:rPr>
-                <w:b w:val="0"/>
-                <w:i w:val="0"/>
-              </w:rPr>
-              <w:t>673</w:t>
-            </w:r>
-          </w:p>
-        </w:tc>
-        <w:tc>
-          <w:tcPr>
-            <w:tcW w:type="dxa" w:w="2880"/>
-          </w:tcPr>
-          <w:p>
-            <w:r>
-              <w:rPr>
-                <w:b/>
-                <w:i w:val="0"/>
-              </w:rPr>
-              <w:t>26</w:t>
-            </w:r>
-          </w:p>
-        </w:tc>
-      </w:tr>
-      <w:tr>
-        <w:tc>
-          <w:tcPr>
-            <w:tcW w:type="dxa" w:w="2880"/>
-          </w:tcPr>
-          <w:p>
-            <w:r>
-              <w:rPr>
-                <w:rFonts w:ascii="Consolas" w:hAnsi="Consolas"/>
-                <w:b w:val="0"/>
-                <w:i w:val="0"/>
-                <w:color w:val="333333"/>
-                <w:sz w:val="20"/>
-              </w:rPr>
-              <w:t>city</w:t>
-            </w:r>
-          </w:p>
-        </w:tc>
-        <w:tc>
-          <w:tcPr>
-            <w:tcW w:type="dxa" w:w="2880"/>
-          </w:tcPr>
-          <w:p>
-            <w:r>
-              <w:rPr>
-                <w:b w:val="0"/>
-                <w:i w:val="0"/>
-              </w:rPr>
-              <w:t>614</w:t>
-            </w:r>
-          </w:p>
-        </w:tc>
-        <w:tc>
-          <w:tcPr>
-            <w:tcW w:type="dxa" w:w="2880"/>
-          </w:tcPr>
-          <w:p>
-            <w:r>
-              <w:rPr>
-                <w:b/>
-                <w:i w:val="0"/>
-              </w:rPr>
-              <w:t>48</w:t>
-            </w:r>
-          </w:p>
-        </w:tc>
-      </w:tr>
-      <w:tr>
-        <w:tc>
-          <w:tcPr>
-            <w:tcW w:type="dxa" w:w="2880"/>
-          </w:tcPr>
-          <w:p>
-            <w:r>
-              <w:rPr>
-                <w:rFonts w:ascii="Consolas" w:hAnsi="Consolas"/>
-                <w:b w:val="0"/>
-                <w:i w:val="0"/>
-                <w:color w:val="333333"/>
-                <w:sz w:val="20"/>
-              </w:rPr>
-              <w:t>country_code</w:t>
-            </w:r>
-          </w:p>
-        </w:tc>
-        <w:tc>
-          <w:tcPr>
-            <w:tcW w:type="dxa" w:w="2880"/>
-          </w:tcPr>
-          <w:p>
-            <w:r>
-              <w:rPr>
-                <w:b w:val="0"/>
-                <w:i w:val="0"/>
-              </w:rPr>
-              <w:t>59</w:t>
-            </w:r>
-          </w:p>
-        </w:tc>
-        <w:tc>
-          <w:tcPr>
-            <w:tcW w:type="dxa" w:w="2880"/>
-          </w:tcPr>
-          <w:p>
-            <w:r>
-              <w:rPr>
-                <w:b/>
-                <w:i w:val="0"/>
-              </w:rPr>
-              <w:t>1</w:t>
-            </w:r>
-          </w:p>
-        </w:tc>
-      </w:tr>
-    </w:tbl>
-    <w:p/>
-    <w:p>
+      <w:r>
+        <w:rPr>
+          <w:rFonts w:ascii="Consolas" w:hAnsi="Consolas"/>
+          <w:b w:val="0"/>
+          <w:i w:val="0"/>
+          <w:color w:val="333333"/>
+          <w:sz w:val="20"/>
+        </w:rPr>
+        <w:t>city</w:t>
+      </w:r>
       <w:r>
         <w:rPr>
           <w:b w:val="0"/>
           <w:i w:val="0"/>
         </w:rPr>
-        <w:t>Els telèfons (4.879) són format que ja ve així de SAP, i la resta —raons socials, comercials— són canvis reals de dada.</w:t>
+        <w:t xml:space="preserve"> 614 → 48. Els telèfons ja vénen amb aquell format de SAP.</w:t>
       </w:r>
     </w:p>
     <w:p>
@@ -750,17 +356,7 @@
           <w:b w:val="0"/>
           <w:i w:val="0"/>
         </w:rPr>
-        <w:t xml:space="preserve">: no és un error, i val més no fer el </w:t>
-      </w:r>
-      <w:r>
-        <w:rPr>
-          <w:rFonts w:ascii="Consolas" w:hAnsi="Consolas"/>
-          <w:b w:val="0"/>
-          <w:i w:val="0"/>
-          <w:color w:val="333333"/>
-          <w:sz w:val="20"/>
-        </w:rPr>
-        <w:t>REPLACE</w:t>
+        <w:t xml:space="preserve"> no és un error</w:t>
       </w:r>
     </w:p>
     <w:p>
@@ -769,66 +365,58 @@
           <w:b w:val="0"/>
           <w:i w:val="0"/>
         </w:rPr>
-        <w:t xml:space="preserve">Això té explicació i </w:t>
+        <w:t xml:space="preserve">Ho he mirat a SAP i té data: </w:t>
       </w:r>
       <w:r>
         <w:rPr>
           <w:b/>
           <w:i w:val="0"/>
         </w:rPr>
-        <w:t>data exacta</w:t>
+        <w:t>el 25 de setembre es va anonimitzar la còpia de test</w:t>
       </w:r>
       <w:r>
         <w:rPr>
           <w:b w:val="0"/>
           <w:i w:val="0"/>
         </w:rPr>
-        <w:t xml:space="preserve">. Ho he mirat a SAP: </w:t>
+        <w:t xml:space="preserve"> —4.631 clients tocats, 2.253 amb el prefix i 2.378 amb el correu buidat— perquè de la base de proves no surtin correus cap a clients de debò. Només afecta el camp del correu.</w:t>
+      </w:r>
+    </w:p>
+    <w:p>
+      <w:r>
+        <w:rPr>
+          <w:b w:val="0"/>
+          <w:i w:val="0"/>
+        </w:rPr>
+        <w:t xml:space="preserve">Dues coses per si us serveixen: </w:t>
       </w:r>
       <w:r>
         <w:rPr>
           <w:b/>
           <w:i w:val="0"/>
         </w:rPr>
-        <w:t>el 25 de setembre es va fer una operació sobre 4.631 dels 4.691 clients de la companyia de proves</w:t>
+        <w:t>no marca clients inactius</w:t>
       </w:r>
       <w:r>
         <w:rPr>
           <w:b w:val="0"/>
           <w:i w:val="0"/>
         </w:rPr>
-        <w:t xml:space="preserve">, que a 2.253 els va posar </w:t>
+        <w:t xml:space="preserve"> (849 dels 2.305 estan actius), i a </w:t>
       </w:r>
       <w:r>
         <w:rPr>
-          <w:rFonts w:ascii="Consolas" w:hAnsi="Consolas"/>
-          <w:b w:val="0"/>
+          <w:b/>
           <w:i w:val="0"/>
-          <w:color w:val="333333"/>
-          <w:sz w:val="20"/>
         </w:rPr>
-        <w:t>DESHABILITAT__</w:t>
+        <w:t>26</w:t>
       </w:r>
       <w:r>
         <w:rPr>
           <w:b w:val="0"/>
           <w:i w:val="0"/>
         </w:rPr>
-        <w:t xml:space="preserve"> davant del correu i a 2.378 els el va buidar. És l'</w:t>
-      </w:r>
-      <w:r>
-        <w:rPr>
-          <w:b/>
-          <w:i w:val="0"/>
-        </w:rPr>
-        <w:t>anonimització de la còpia de test</w:t>
-      </w:r>
-      <w:r>
-        <w:rPr>
-          <w:b w:val="0"/>
-          <w:i w:val="0"/>
-        </w:rPr>
-        <w:t>, perquè de la base de proves no surtin correus cap a clients de debò. Només afecta el camp del correu electrònic: ni els noms, ni les adreces, ni els articles.</w:t>
+        <w:t xml:space="preserve"> el correu us arriba tallat, perquè el camp té 60 caràcters heretats de KAIS i el prefix se'n menja 14.</w:t>
       </w:r>
     </w:p>
     <w:p>
@@ -837,82 +425,21 @@
           <w:b/>
           <w:i w:val="0"/>
         </w:rPr>
-        <w:t>Dues coses per si us serveixen:</w:t>
-      </w:r>
-    </w:p>
-    <w:p>
-      <w:pPr>
-        <w:pStyle w:val="ListBullet"/>
-      </w:pPr>
-      <w:r>
-        <w:rPr>
-          <w:b/>
-          <w:i w:val="0"/>
-        </w:rPr>
-        <w:t>No marca clients inactius.</w:t>
+        <w:t>Quan apuntem el procés a la SAP de producció desapareix sol</w:t>
       </w:r>
       <w:r>
         <w:rPr>
           <w:b w:val="0"/>
           <w:i w:val="0"/>
         </w:rPr>
-        <w:t xml:space="preserve"> Dels 2.305 clients amb el prefix, </w:t>
+        <w:t xml:space="preserve">, així que et demanaria que </w:t>
       </w:r>
       <w:r>
         <w:rPr>
           <w:b/>
           <w:i w:val="0"/>
         </w:rPr>
-        <w:t>849 estan actius</w:t>
-      </w:r>
-      <w:r>
-        <w:rPr>
-          <w:b w:val="0"/>
-          <w:i w:val="0"/>
-        </w:rPr>
-        <w:t>. Si ho interpretéssiu com una marca de baixa, us equivocaria.</w:t>
-      </w:r>
-    </w:p>
-    <w:p>
-      <w:pPr>
-        <w:pStyle w:val="ListBullet"/>
-      </w:pPr>
-      <w:r>
-        <w:rPr>
-          <w:b/>
-          <w:i w:val="0"/>
-        </w:rPr>
-        <w:t>A 26 clients el correu us arriba tallat</w:t>
-      </w:r>
-      <w:r>
-        <w:rPr>
-          <w:b w:val="0"/>
-          <w:i w:val="0"/>
-        </w:rPr>
-        <w:t>, perquè el camp té 60 caràcters d'amplada (heretada de KAIS) i el prefix se'n menja 14.</w:t>
-      </w:r>
-    </w:p>
-    <w:p>
-      <w:r>
-        <w:rPr>
-          <w:b/>
-          <w:i w:val="0"/>
-        </w:rPr>
-        <w:t>Quan apuntem el procés a la SAP de producció, això desapareix sol: allà els correus són els de debò.</w:t>
-      </w:r>
-      <w:r>
-        <w:rPr>
-          <w:b w:val="0"/>
-          <w:i w:val="0"/>
-        </w:rPr>
-        <w:t xml:space="preserve"> Per això et demanaria que </w:t>
-      </w:r>
-      <w:r>
-        <w:rPr>
-          <w:b/>
-          <w:i w:val="0"/>
-        </w:rPr>
-        <w:t xml:space="preserve">no hi posessis un </w:t>
+        <w:t xml:space="preserve">no hi posessis el </w:t>
       </w:r>
       <w:r>
         <w:rPr>
@@ -929,7 +456,7 @@
           <w:b w:val="0"/>
           <w:i w:val="0"/>
         </w:rPr>
-        <w:t>: si algun dia el prefix torna a aparèixer, voldrà dir que algú ha carregat dades de proves al sistema de producció, i això val més veure-ho que tapar-ho. És el mateix criteri pel qual mantenim les nostres alarmes encara que a test siguin molestes.</w:t>
+        <w:t>: si algun dia el prefix hi torna a sortir, voldrà dir que algú ha carregat dades de proves a producció, i això val més veure-ho que tapar-ho.</w:t>
       </w:r>
     </w:p>
     <w:p>
@@ -941,81 +468,23 @@
           <w:b w:val="0"/>
           <w:i w:val="0"/>
         </w:rPr>
-        <w:t>Les claus repetides</w:t>
+        <w:t>Dues coses curtes</w:t>
       </w:r>
     </w:p>
     <w:p>
       <w:r>
         <w:rPr>
-          <w:b w:val="0"/>
+          <w:b/>
           <w:i w:val="0"/>
         </w:rPr>
-        <w:t xml:space="preserve">Les tres de </w:t>
-      </w:r>
-      <w:r>
-        <w:rPr>
-          <w:rFonts w:ascii="Consolas" w:hAnsi="Consolas"/>
-          <w:b w:val="0"/>
-          <w:i w:val="0"/>
-          <w:color w:val="333333"/>
-          <w:sz w:val="20"/>
-        </w:rPr>
-        <w:t>1609777</w:t>
+        <w:t>Les claus repetides</w:t>
       </w:r>
       <w:r>
         <w:rPr>
           <w:b w:val="0"/>
           <w:i w:val="0"/>
         </w:rPr>
-        <w:t xml:space="preserve">, </w:t>
-      </w:r>
-      <w:r>
-        <w:rPr>
-          <w:rFonts w:ascii="Consolas" w:hAnsi="Consolas"/>
-          <w:b w:val="0"/>
-          <w:i w:val="0"/>
-          <w:color w:val="333333"/>
-          <w:sz w:val="20"/>
-        </w:rPr>
-        <w:t>1609882</w:t>
-      </w:r>
-      <w:r>
-        <w:rPr>
-          <w:b w:val="0"/>
-          <w:i w:val="0"/>
-        </w:rPr>
-        <w:t xml:space="preserve"> i </w:t>
-      </w:r>
-      <w:r>
-        <w:rPr>
-          <w:rFonts w:ascii="Consolas" w:hAnsi="Consolas"/>
-          <w:b w:val="0"/>
-          <w:i w:val="0"/>
-          <w:color w:val="333333"/>
-          <w:sz w:val="20"/>
-        </w:rPr>
-        <w:t>1612956</w:t>
-      </w:r>
-      <w:r>
-        <w:rPr>
-          <w:b w:val="0"/>
-          <w:i w:val="0"/>
-        </w:rPr>
-        <w:t xml:space="preserve"> són del fitxer que t'arriba ara de KAIS, i a la nostra banda </w:t>
-      </w:r>
-      <w:r>
-        <w:rPr>
-          <w:b/>
-          <w:i w:val="0"/>
-        </w:rPr>
-        <w:t>no poden passar</w:t>
-      </w:r>
-      <w:r>
-        <w:rPr>
-          <w:b w:val="0"/>
-          <w:i w:val="0"/>
-        </w:rPr>
-        <w:t xml:space="preserve">: </w:t>
+        <w:t xml:space="preserve"> no poden passar a la nostra banda: </w:t>
       </w:r>
       <w:r>
         <w:rPr>
@@ -1032,7 +501,7 @@
           <w:b w:val="0"/>
           <w:i w:val="0"/>
         </w:rPr>
-        <w:t xml:space="preserve"> és clau primària a la nostra base de dades, així que un duplicat faria fallar la càrrega en comptes de deixar-te dues files. Tal com dius, amb el nou origen no hauries de tornar-ne a veure.</w:t>
+        <w:t xml:space="preserve"> és clau primària, i un duplicat faria fallar la càrrega en comptes de deixar-te dues files.</w:t>
       </w:r>
     </w:p>
     <w:p>
@@ -1041,14 +510,14 @@
           <w:b/>
           <w:i w:val="0"/>
         </w:rPr>
-        <w:t>Una pregunta que ve d'aquí, i val més fer-la ara que el dia 2.</w:t>
+        <w:t>I una pregunta que ve d'aquí</w:t>
       </w:r>
       <w:r>
         <w:rPr>
           <w:b w:val="0"/>
           <w:i w:val="0"/>
         </w:rPr>
-        <w:t xml:space="preserve"> El nostre </w:t>
+        <w:t xml:space="preserve">, millor ara que el dia 2: el nostre </w:t>
       </w:r>
       <w:r>
         <w:rPr>
@@ -1065,7 +534,7 @@
           <w:b w:val="0"/>
           <w:i w:val="0"/>
         </w:rPr>
-        <w:t xml:space="preserve"> es construeix com </w:t>
+        <w:t xml:space="preserve"> és </w:t>
       </w:r>
       <w:r>
         <w:rPr>
@@ -1075,14 +544,14 @@
           <w:color w:val="333333"/>
           <w:sz w:val="20"/>
         </w:rPr>
-        <w:t>origen + número de document × 100 + número de línia</w:t>
+        <w:t>origen + document × 100 + línia</w:t>
       </w:r>
       <w:r>
         <w:rPr>
           <w:b w:val="0"/>
           <w:i w:val="0"/>
         </w:rPr>
-        <w:t xml:space="preserve">, que és el format que us donava KAIS. Això </w:t>
+        <w:t xml:space="preserve">, el format que us donava KAIS, i això </w:t>
       </w:r>
       <w:r>
         <w:rPr>
@@ -1096,7 +565,7 @@
           <w:b w:val="0"/>
           <w:i w:val="0"/>
         </w:rPr>
-        <w:t xml:space="preserve">: un albarà o una factura de </w:t>
+        <w:t xml:space="preserve">. Un document de </w:t>
       </w:r>
       <w:r>
         <w:rPr>
@@ -1110,40 +579,28 @@
           <w:b w:val="0"/>
           <w:i w:val="0"/>
         </w:rPr>
-        <w:t xml:space="preserve"> no hi cabria. Al vostre històric de KAIS, hi ha documents tan llargs? Si em dius que sí, ho canviem abans del tall i acordem el format nou; si no, ho deixem com està i ho vigilem.</w:t>
+        <w:t xml:space="preserve"> no hi cabria. Al vostre històric n'hi ha? Si em dius que sí, acordem el format nou abans del tall.</w:t>
       </w:r>
     </w:p>
     <w:p>
-      <w:pPr>
-        <w:pStyle w:val="Heading2"/>
-      </w:pPr>
+      <w:r>
+        <w:rPr>
+          <w:b/>
+          <w:i w:val="0"/>
+        </w:rPr>
+        <w:t>Els accents:</w:t>
+      </w:r>
       <w:r>
         <w:rPr>
           <w:b w:val="0"/>
           <w:i w:val="0"/>
         </w:rPr>
-        <w:t>Els accents i les cometes</w:t>
-      </w:r>
-    </w:p>
-    <w:p>
-      <w:r>
-        <w:rPr>
-          <w:b w:val="0"/>
-          <w:i w:val="0"/>
-        </w:rPr>
-        <w:t xml:space="preserve">Gràcies per trobar-ho: jo t'havia apuntat cap a la codificació del fitxer i </w:t>
-      </w:r>
-      <w:r>
-        <w:rPr>
-          <w:b/>
-          <w:i w:val="0"/>
-        </w:rPr>
-        <w:t xml:space="preserve">era el </w:t>
+        <w:t xml:space="preserve"> gràcies per trobar-ho, jo t'havia apuntat cap a la codificació del fitxer i era el </w:t>
       </w:r>
       <w:r>
         <w:rPr>
           <w:rFonts w:ascii="Consolas" w:hAnsi="Consolas"/>
-          <w:b/>
+          <w:b w:val="0"/>
           <w:i w:val="0"/>
           <w:color w:val="333333"/>
           <w:sz w:val="20"/>
@@ -1152,7 +609,7 @@
       </w:r>
       <w:r>
         <w:rPr>
-          <w:b/>
+          <w:b w:val="0"/>
           <w:i w:val="0"/>
         </w:rPr>
         <w:t xml:space="preserve"> del </w:t>
@@ -1160,7 +617,7 @@
       <w:r>
         <w:rPr>
           <w:rFonts w:ascii="Consolas" w:hAnsi="Consolas"/>
-          <w:b/>
+          <w:b w:val="0"/>
           <w:i w:val="0"/>
           <w:color w:val="333333"/>
           <w:sz w:val="20"/>
@@ -1172,7 +629,7 @@
           <w:b w:val="0"/>
           <w:i w:val="0"/>
         </w:rPr>
-        <w:t>. Me'l quedo apuntat. Les cometes de l'escapament que vénen de la nostra banda —3 noms de client, 5 adreces, 25 articles i 34 correus— les farem netejar a SAP igualment, perquè una d'aquelles cometes ens tapava el número d'una adreça.</w:t>
+        <w:t>. Les cometes que vénen de la nostra banda les farem netejar a SAP igualment.</w:t>
       </w:r>
     </w:p>
     <w:p>
@@ -1193,26 +650,7 @@
           <w:b w:val="0"/>
           <w:i w:val="0"/>
         </w:rPr>
-        <w:t>D'això no em dius res i és l'únic que em queda del correu anterior. Recordo les dues preguntes:</w:t>
-      </w:r>
-    </w:p>
-    <w:p>
-      <w:pPr>
-        <w:pStyle w:val="ListBullet"/>
-      </w:pPr>
-      <w:r>
-        <w:rPr>
-          <w:b/>
-          <w:i w:val="0"/>
-        </w:rPr>
-        <w:t>El magatzem</w:t>
-      </w:r>
-      <w:r>
-        <w:rPr>
-          <w:b w:val="0"/>
-          <w:i w:val="0"/>
-        </w:rPr>
-        <w:t xml:space="preserve">: a SAP no és una dada de l'article sinó de </w:t>
+        <w:t xml:space="preserve">És l'únic que em queda del correu anterior. A SAP el magatzem no és una dada de l'article sinó de </w:t>
       </w:r>
       <w:r>
         <w:rPr>
@@ -1226,7 +664,7 @@
           <w:b w:val="0"/>
           <w:i w:val="0"/>
         </w:rPr>
-        <w:t xml:space="preserve">. Avui no us el portem. Es pot afegir, però és una columna nova a </w:t>
+        <w:t xml:space="preserve">; avui no us el portem i afegir-lo és una columna nova a </w:t>
       </w:r>
       <w:r>
         <w:rPr>
@@ -1243,26 +681,21 @@
           <w:b w:val="0"/>
           <w:i w:val="0"/>
         </w:rPr>
-        <w:t>, que és contracte: digue'm el nom i el format. ⚠️ I compta que la sèrie començaria el 2 de novembre de 2026, perquè la SAP de producció arrenca sense històric documental.</w:t>
+        <w:t xml:space="preserve">, que és contracte: digue'm nom i format. Compta que la sèrie començaria el 2 de novembre, perquè la SAP de producció arrenca sense històric documental. I de </w:t>
       </w:r>
-    </w:p>
-    <w:p>
-      <w:pPr>
-        <w:pStyle w:val="ListBullet"/>
-      </w:pPr>
       <w:r>
         <w:rPr>
           <w:b/>
           <w:i w:val="0"/>
         </w:rPr>
-        <w:t>Les previsions</w:t>
+        <w:t>previsions</w:t>
       </w:r>
       <w:r>
         <w:rPr>
           <w:b w:val="0"/>
           <w:i w:val="0"/>
         </w:rPr>
-        <w:t>: no n'hi ha res a la guia d'importació. Què fa Analitza CM amb una previsió i quines dades d'entrada demana?</w:t>
+        <w:t xml:space="preserve"> no n'hi ha res a la guia d'importació: què fa Analitza CM amb una previsió i quines dades demana?</w:t>
       </w:r>
     </w:p>
     <w:p>

</xml_diff>

<commit_message>
El product_cost entra al correu: es el forat gros que queda
Amb el /100 tancat, el product_cost passa al davant. Mesurat avui:
dbo.est_linies_albara te 231 linies i 231 amb product_cost = 0, perque
Sync:CostField val none a proposit -SL no exposa res equivalent a
DLN1.StockPrice i GrossBuyPrice es un altre concepte, 48 de 52-.

El que ho fa urgent es que el seu correu del 05/10 demostra que SEGUEIX
consumint la columna: product_cost/100 es un dels canvis que fara. O sigui
que el dia 2 veuria cost zero i marges a zero, cada xifra coherent amb ella
mateixa i cap check capac de veure-ho. Mateixa familia que el /100.

Se li pregunta amb les tres sortides de la 6.2 i sense recomanar-ne cap: es
seva la tria. I queda com a fila propia a la taula de dependencies del
runbook, que aixi no es pot tancar mentre aixo estigui obert.

Co-Authored-By: Claude Opus 5 (1M context) <noreply@anthropic.com>
</commit_message>
<xml_diff>
--- a/resposta_adria_5.docx
+++ b/resposta_adria_5.docx
@@ -228,6 +228,220 @@
           <w:i w:val="0"/>
         </w:rPr>
         <w:t>, entesos.</w:t>
+      </w:r>
+    </w:p>
+    <w:p>
+      <w:pPr>
+        <w:pStyle w:val="Heading2"/>
+      </w:pPr>
+      <w:r>
+        <w:rPr>
+          <w:b w:val="0"/>
+          <w:i w:val="0"/>
+        </w:rPr>
+        <w:t xml:space="preserve">El </w:t>
+      </w:r>
+      <w:r>
+        <w:rPr>
+          <w:rFonts w:ascii="Consolas" w:hAnsi="Consolas"/>
+          <w:b w:val="0"/>
+          <w:i w:val="0"/>
+          <w:color w:val="333333"/>
+          <w:sz w:val="20"/>
+        </w:rPr>
+        <w:t>product_cost</w:t>
+      </w:r>
+      <w:r>
+        <w:rPr>
+          <w:b w:val="0"/>
+          <w:i w:val="0"/>
+        </w:rPr>
+        <w:t xml:space="preserve"> us arribarà a zero si no ho decidim</w:t>
+      </w:r>
+    </w:p>
+    <w:p>
+      <w:r>
+        <w:rPr>
+          <w:b w:val="0"/>
+          <w:i w:val="0"/>
+        </w:rPr>
+        <w:t xml:space="preserve">Justament perquè al teu canvi hi ha </w:t>
+      </w:r>
+      <w:r>
+        <w:rPr>
+          <w:rFonts w:ascii="Consolas" w:hAnsi="Consolas"/>
+          <w:b w:val="0"/>
+          <w:i w:val="0"/>
+          <w:color w:val="333333"/>
+          <w:sz w:val="20"/>
+        </w:rPr>
+        <w:t>product_cost/100</w:t>
+      </w:r>
+      <w:r>
+        <w:rPr>
+          <w:b w:val="0"/>
+          <w:i w:val="0"/>
+        </w:rPr>
+        <w:t xml:space="preserve">, t'ho avanço: </w:t>
+      </w:r>
+      <w:r>
+        <w:rPr>
+          <w:b/>
+          <w:i w:val="0"/>
+        </w:rPr>
+        <w:t>avui aquella columna va a 0 a totes les línies</w:t>
+      </w:r>
+      <w:r>
+        <w:rPr>
+          <w:b w:val="0"/>
+          <w:i w:val="0"/>
+        </w:rPr>
+        <w:t xml:space="preserve">, i no és un error de càrrega. KAIS us donava el cost mitjà de l'article </w:t>
+      </w:r>
+      <w:r>
+        <w:rPr>
+          <w:b/>
+          <w:i w:val="0"/>
+        </w:rPr>
+        <w:t>congelat al moment de l'albarà</w:t>
+      </w:r>
+      <w:r>
+        <w:rPr>
+          <w:b w:val="0"/>
+          <w:i w:val="0"/>
+        </w:rPr>
+        <w:t xml:space="preserve">, i Service Layer —l'API oficial de SAP, que és per on hem de passar ara— </w:t>
+      </w:r>
+      <w:r>
+        <w:rPr>
+          <w:b/>
+          <w:i w:val="0"/>
+        </w:rPr>
+        <w:t>no exposa res equivalent</w:t>
+      </w:r>
+      <w:r>
+        <w:rPr>
+          <w:b w:val="0"/>
+          <w:i w:val="0"/>
+        </w:rPr>
+        <w:t xml:space="preserve">. El candidat més pròxim és el preu de compra </w:t>
+      </w:r>
+      <w:r>
+        <w:rPr>
+          <w:b/>
+          <w:i w:val="0"/>
+        </w:rPr>
+        <w:t>actual</w:t>
+      </w:r>
+      <w:r>
+        <w:rPr>
+          <w:b w:val="0"/>
+          <w:i w:val="0"/>
+        </w:rPr>
+        <w:t xml:space="preserve"> de l'article: coincideix amb el que us arribava en un 92 % dels casos, però </w:t>
+      </w:r>
+      <w:r>
+        <w:rPr>
+          <w:b/>
+          <w:i w:val="0"/>
+        </w:rPr>
+        <w:t>no és el mateix concepte</w:t>
+      </w:r>
+      <w:r>
+        <w:rPr>
+          <w:b w:val="0"/>
+          <w:i w:val="0"/>
+        </w:rPr>
+        <w:t xml:space="preserve"> —un article que hagi mogut el cost des de l'albarà ja no quadra—, i no te'l vull colar com si fos el mateix camp.</w:t>
+      </w:r>
+    </w:p>
+    <w:p>
+      <w:r>
+        <w:rPr>
+          <w:b w:val="0"/>
+          <w:i w:val="0"/>
+        </w:rPr>
+        <w:t xml:space="preserve">Tal com està, el 2 de novembre tindríeu </w:t>
+      </w:r>
+      <w:r>
+        <w:rPr>
+          <w:b/>
+          <w:i w:val="0"/>
+        </w:rPr>
+        <w:t>cost zero i marges a zero</w:t>
+      </w:r>
+      <w:r>
+        <w:rPr>
+          <w:b w:val="0"/>
+          <w:i w:val="0"/>
+        </w:rPr>
+        <w:t>, i per cada xifra per separat semblaria correcte. Tres sortides, i la tria és vostra:</w:t>
+      </w:r>
+    </w:p>
+    <w:p>
+      <w:pPr>
+        <w:pStyle w:val="ListNumber"/>
+      </w:pPr>
+      <w:r>
+        <w:rPr>
+          <w:b/>
+          <w:i w:val="0"/>
+        </w:rPr>
+        <w:t>Accepteu el preu de compra actual</w:t>
+      </w:r>
+      <w:r>
+        <w:rPr>
+          <w:b w:val="0"/>
+          <w:i w:val="0"/>
+        </w:rPr>
+        <w:t xml:space="preserve"> com a aproximació, sabent exactament què és.</w:t>
+      </w:r>
+    </w:p>
+    <w:p>
+      <w:pPr>
+        <w:pStyle w:val="ListNumber"/>
+      </w:pPr>
+      <w:r>
+        <w:rPr>
+          <w:b/>
+          <w:i w:val="0"/>
+        </w:rPr>
+        <w:t>Em dieu una altra definició de cost</w:t>
+      </w:r>
+      <w:r>
+        <w:rPr>
+          <w:b w:val="0"/>
+          <w:i w:val="0"/>
+        </w:rPr>
+        <w:t xml:space="preserve"> i miro si la puc obtenir de SAP.</w:t>
+      </w:r>
+    </w:p>
+    <w:p>
+      <w:pPr>
+        <w:pStyle w:val="ListNumber"/>
+      </w:pPr>
+      <w:r>
+        <w:rPr>
+          <w:b/>
+          <w:i w:val="0"/>
+        </w:rPr>
+        <w:t>Em confirmeu que ja no el feu servir</w:t>
+      </w:r>
+      <w:r>
+        <w:rPr>
+          <w:b w:val="0"/>
+          <w:i w:val="0"/>
+        </w:rPr>
+        <w:t xml:space="preserve"> i el deixem buit.</w:t>
+      </w:r>
+    </w:p>
+    <w:p>
+      <w:r>
+        <w:rPr>
+          <w:b w:val="0"/>
+          <w:i w:val="0"/>
+        </w:rPr>
+        <w:t>Qualsevol de les tres em va bé; la que no em va bé és arribar al dia 2 sense haver-ho dit.</w:t>
       </w:r>
     </w:p>
     <w:p>

</xml_diff>

<commit_message>
L esborrany a l Adria: de 24 blocs a 10
Tres punts numerats i prou -product_cost, DESHABILITAT__ i discount-, i la
resta en una linia cadascuna. El /100, el filtre de data i el mapatge de les
ubicacions es despatxen al primer paragraf, perque ja estan d acord.

Fora les taules, l explicacio llarga de l anonimitzacio i els 26 correus
tallats, que a la productiva practicament desapareixen: dir-ho convidaria a
demanar un canvi d amplada que no cal. Les cinc peticions es mantenen senceres.

Co-Authored-By: Claude Opus 5 (1M context) <noreply@anthropic.com>
</commit_message>
<xml_diff>
--- a/resposta_adria_5.docx
+++ b/resposta_adria_5.docx
@@ -34,7 +34,7 @@
           <w:b w:val="0"/>
           <w:i w:val="0"/>
         </w:rPr>
-        <w:t xml:space="preserve">: amb el teu correu ja el tinc tancat per escrit, que era l'únic punt que el dia del tall podia fallar sense que cap validació ho veiés. Us els enviem </w:t>
+        <w:t xml:space="preserve">: queda tancat. Us els enviem </w:t>
       </w:r>
       <w:r>
         <w:rPr>
@@ -65,7 +65,7 @@
           <w:b w:val="0"/>
           <w:i w:val="0"/>
         </w:rPr>
-        <w:t xml:space="preserve"> el treus tu, i </w:t>
+        <w:t xml:space="preserve"> el treus tu i </w:t>
       </w:r>
       <w:r>
         <w:rPr>
@@ -79,138 +79,7 @@
           <w:b w:val="0"/>
           <w:i w:val="0"/>
         </w:rPr>
-        <w:t xml:space="preserve"> — si ho féssim tots dos, tornaria a desquadrar.</w:t>
-      </w:r>
-    </w:p>
-    <w:p>
-      <w:r>
-        <w:rPr>
-          <w:b w:val="0"/>
-          <w:i w:val="0"/>
-        </w:rPr>
-        <w:t xml:space="preserve">⚠️ </w:t>
-      </w:r>
-      <w:r>
-        <w:rPr>
-          <w:b/>
-          <w:i w:val="0"/>
-        </w:rPr>
-        <w:t xml:space="preserve">Del </w:t>
-      </w:r>
-      <w:r>
-        <w:rPr>
-          <w:rFonts w:ascii="Consolas" w:hAnsi="Consolas"/>
-          <w:b/>
-          <w:i w:val="0"/>
-          <w:color w:val="333333"/>
-          <w:sz w:val="20"/>
-        </w:rPr>
-        <w:t>discount</w:t>
-      </w:r>
-      <w:r>
-        <w:rPr>
-          <w:b/>
-          <w:i w:val="0"/>
-        </w:rPr>
-        <w:t xml:space="preserve"> no dius res, i t'ho vull fer confirmar.</w:t>
-      </w:r>
-      <w:r>
-        <w:rPr>
-          <w:b w:val="0"/>
-          <w:i w:val="0"/>
-        </w:rPr>
-        <w:t xml:space="preserve"> Entenc que mantens el teu </w:t>
-      </w:r>
-      <w:r>
-        <w:rPr>
-          <w:rFonts w:ascii="Consolas" w:hAnsi="Consolas"/>
-          <w:b w:val="0"/>
-          <w:i w:val="0"/>
-          <w:color w:val="333333"/>
-          <w:sz w:val="20"/>
-        </w:rPr>
-        <w:t>1 - discount</w:t>
-      </w:r>
-      <w:r>
-        <w:rPr>
-          <w:b w:val="0"/>
-          <w:i w:val="0"/>
-        </w:rPr>
-        <w:t xml:space="preserve"> i que seguim enviant-vos el multiplicador de KAIS (</w:t>
-      </w:r>
-      <w:r>
-        <w:rPr>
-          <w:rFonts w:ascii="Consolas" w:hAnsi="Consolas"/>
-          <w:b w:val="0"/>
-          <w:i w:val="0"/>
-          <w:color w:val="333333"/>
-          <w:sz w:val="20"/>
-        </w:rPr>
-        <w:t>1,00</w:t>
-      </w:r>
-      <w:r>
-        <w:rPr>
-          <w:b w:val="0"/>
-          <w:i w:val="0"/>
-        </w:rPr>
-        <w:t xml:space="preserve"> = sense descompte, </w:t>
-      </w:r>
-      <w:r>
-        <w:rPr>
-          <w:rFonts w:ascii="Consolas" w:hAnsi="Consolas"/>
-          <w:b w:val="0"/>
-          <w:i w:val="0"/>
-          <w:color w:val="333333"/>
-          <w:sz w:val="20"/>
-        </w:rPr>
-        <w:t>0,90</w:t>
-      </w:r>
-      <w:r>
-        <w:rPr>
-          <w:b w:val="0"/>
-          <w:i w:val="0"/>
-        </w:rPr>
-        <w:t xml:space="preserve"> = 10 % de descompte). Ho tenim preparat per normalitzar-ho el dia que vulguis, però </w:t>
-      </w:r>
-      <w:r>
-        <w:rPr>
-          <w:b/>
-          <w:i w:val="0"/>
-        </w:rPr>
-        <w:t>no ho tocarem si no m'ho dius</w:t>
-      </w:r>
-      <w:r>
-        <w:rPr>
-          <w:b w:val="0"/>
-          <w:i w:val="0"/>
-        </w:rPr>
-        <w:t xml:space="preserve">: si el canviéssim nosaltres i tu mantinguessis el </w:t>
-      </w:r>
-      <w:r>
-        <w:rPr>
-          <w:rFonts w:ascii="Consolas" w:hAnsi="Consolas"/>
-          <w:b w:val="0"/>
-          <w:i w:val="0"/>
-          <w:color w:val="333333"/>
-          <w:sz w:val="20"/>
-        </w:rPr>
-        <w:t>1 - discount</w:t>
-      </w:r>
-      <w:r>
-        <w:rPr>
-          <w:b w:val="0"/>
-          <w:i w:val="0"/>
-        </w:rPr>
-        <w:t>, els imports et sortirien a zero.</w:t>
-      </w:r>
-    </w:p>
-    <w:p>
-      <w:r>
-        <w:rPr>
-          <w:b w:val="0"/>
-          <w:i w:val="0"/>
-        </w:rPr>
-        <w:t xml:space="preserve">Del filtre </w:t>
+        <w:t xml:space="preserve"> — si ho féssim tots dos, tornaria a desquadrar. Del filtre </w:t>
       </w:r>
       <w:r>
         <w:rPr>
@@ -227,24 +96,44 @@
           <w:b w:val="0"/>
           <w:i w:val="0"/>
         </w:rPr>
-        <w:t>, entesos.</w:t>
+        <w:t xml:space="preserve">, entesos. I si encara no heu importat res a producció, </w:t>
       </w:r>
-    </w:p>
-    <w:p>
-      <w:pPr>
-        <w:pStyle w:val="Heading2"/>
-      </w:pPr>
+      <w:r>
+        <w:rPr>
+          <w:b/>
+          <w:i w:val="0"/>
+        </w:rPr>
+        <w:t>el mapatge de les ubicacions no us cal</w:t>
+      </w:r>
       <w:r>
         <w:rPr>
           <w:b w:val="0"/>
           <w:i w:val="0"/>
         </w:rPr>
-        <w:t xml:space="preserve">El </w:t>
+        <w:t xml:space="preserve"> i no t'empipo més: el tinc guardat per si mai el demanes.</w:t>
+      </w:r>
+    </w:p>
+    <w:p>
+      <w:r>
+        <w:rPr>
+          <w:b w:val="0"/>
+          <w:i w:val="0"/>
+        </w:rPr>
+        <w:t>Em queden tres coses.</w:t>
+      </w:r>
+    </w:p>
+    <w:p>
+      <w:r>
+        <w:rPr>
+          <w:b/>
+          <w:i w:val="0"/>
+        </w:rPr>
+        <w:t xml:space="preserve">1. El </w:t>
       </w:r>
       <w:r>
         <w:rPr>
           <w:rFonts w:ascii="Consolas" w:hAnsi="Consolas"/>
-          <w:b w:val="0"/>
+          <w:b/>
           <w:i w:val="0"/>
           <w:color w:val="333333"/>
           <w:sz w:val="20"/>
@@ -253,19 +142,17 @@
       </w:r>
       <w:r>
         <w:rPr>
-          <w:b w:val="0"/>
+          <w:b/>
           <w:i w:val="0"/>
         </w:rPr>
-        <w:t xml:space="preserve"> us arribarà a zero si no ho decidim</w:t>
+        <w:t xml:space="preserve"> us arribarà a zero si no ho decidim.</w:t>
       </w:r>
-    </w:p>
-    <w:p>
       <w:r>
         <w:rPr>
           <w:b w:val="0"/>
           <w:i w:val="0"/>
         </w:rPr>
-        <w:t xml:space="preserve">Justament perquè al teu canvi hi ha </w:t>
+        <w:t xml:space="preserve"> Ho dic perquè al teu canvi hi ha </w:t>
       </w:r>
       <w:r>
         <w:rPr>
@@ -282,21 +169,21 @@
           <w:b w:val="0"/>
           <w:i w:val="0"/>
         </w:rPr>
-        <w:t xml:space="preserve">, t'ho avanço: </w:t>
+        <w:t xml:space="preserve">: avui aquella columna va a </w:t>
       </w:r>
       <w:r>
         <w:rPr>
           <w:b/>
           <w:i w:val="0"/>
         </w:rPr>
-        <w:t>avui aquella columna va a 0 a totes les línies</w:t>
+        <w:t>0 a totes les línies</w:t>
       </w:r>
       <w:r>
         <w:rPr>
           <w:b w:val="0"/>
           <w:i w:val="0"/>
         </w:rPr>
-        <w:t xml:space="preserve">, i no és un error de càrrega. KAIS us donava el cost mitjà de l'article </w:t>
+        <w:t xml:space="preserve">, i no és un error de càrrega. KAIS us donava el cost de l'article </w:t>
       </w:r>
       <w:r>
         <w:rPr>
@@ -310,7 +197,7 @@
           <w:b w:val="0"/>
           <w:i w:val="0"/>
         </w:rPr>
-        <w:t xml:space="preserve">, i Service Layer —l'API oficial de SAP, que és per on hem de passar ara— </w:t>
+        <w:t xml:space="preserve">, i Service Layer —l'API oficial de SAP, per on hem de passar ara— </w:t>
       </w:r>
       <w:r>
         <w:rPr>
@@ -324,7 +211,7 @@
           <w:b w:val="0"/>
           <w:i w:val="0"/>
         </w:rPr>
-        <w:t xml:space="preserve">. El candidat més pròxim és el preu de compra </w:t>
+        <w:t xml:space="preserve">. El més pròxim és el preu de compra </w:t>
       </w:r>
       <w:r>
         <w:rPr>
@@ -338,7 +225,7 @@
           <w:b w:val="0"/>
           <w:i w:val="0"/>
         </w:rPr>
-        <w:t xml:space="preserve"> de l'article: coincideix amb el que us arribava en un 92 % dels casos, però </w:t>
+        <w:t xml:space="preserve">, que coincidia amb el vostre en un 92 %, però </w:t>
       </w:r>
       <w:r>
         <w:rPr>
@@ -352,96 +239,49 @@
           <w:b w:val="0"/>
           <w:i w:val="0"/>
         </w:rPr>
-        <w:t xml:space="preserve"> —un article que hagi mogut el cost des de l'albarà ja no quadra—, i no te'l vull colar com si fos el mateix camp.</w:t>
-      </w:r>
-    </w:p>
-    <w:p>
-      <w:r>
-        <w:rPr>
-          <w:b w:val="0"/>
-          <w:i w:val="0"/>
-        </w:rPr>
-        <w:t xml:space="preserve">Tal com està, el 2 de novembre tindríeu </w:t>
+        <w:t xml:space="preserve"> i no te'l vull colar com si ho fos. Tal com està, el dia 2 tindríeu marges a zero i cada xifra semblaria correcta per separat. Tria tu: </w:t>
       </w:r>
       <w:r>
         <w:rPr>
           <w:b/>
           <w:i w:val="0"/>
         </w:rPr>
-        <w:t>cost zero i marges a zero</w:t>
+        <w:t>accepteu el preu de compra actual</w:t>
       </w:r>
       <w:r>
         <w:rPr>
           <w:b w:val="0"/>
           <w:i w:val="0"/>
         </w:rPr>
-        <w:t>, i per cada xifra per separat semblaria correcte. Tres sortides, i la tria és vostra:</w:t>
+        <w:t xml:space="preserve"> sabent què és, </w:t>
       </w:r>
-    </w:p>
-    <w:p>
-      <w:pPr>
-        <w:pStyle w:val="ListNumber"/>
-      </w:pPr>
       <w:r>
         <w:rPr>
           <w:b/>
           <w:i w:val="0"/>
         </w:rPr>
-        <w:t>Accepteu el preu de compra actual</w:t>
+        <w:t>em dieu una altra definició</w:t>
       </w:r>
       <w:r>
         <w:rPr>
           <w:b w:val="0"/>
           <w:i w:val="0"/>
         </w:rPr>
-        <w:t xml:space="preserve"> com a aproximació, sabent exactament què és.</w:t>
+        <w:t xml:space="preserve"> i miro si la puc obtenir, o </w:t>
       </w:r>
-    </w:p>
-    <w:p>
-      <w:pPr>
-        <w:pStyle w:val="ListNumber"/>
-      </w:pPr>
       <w:r>
         <w:rPr>
           <w:b/>
           <w:i w:val="0"/>
         </w:rPr>
-        <w:t>Em dieu una altra definició de cost</w:t>
+        <w:t>em confirmeu que ja no el feu servir</w:t>
       </w:r>
       <w:r>
         <w:rPr>
           <w:b w:val="0"/>
           <w:i w:val="0"/>
         </w:rPr>
-        <w:t xml:space="preserve"> i miro si la puc obtenir de SAP.</w:t>
-      </w:r>
-    </w:p>
-    <w:p>
-      <w:pPr>
-        <w:pStyle w:val="ListNumber"/>
-      </w:pPr>
-      <w:r>
-        <w:rPr>
-          <w:b/>
-          <w:i w:val="0"/>
-        </w:rPr>
-        <w:t>Em confirmeu que ja no el feu servir</w:t>
-      </w:r>
-      <w:r>
-        <w:rPr>
-          <w:b w:val="0"/>
-          <w:i w:val="0"/>
-        </w:rPr>
-        <w:t xml:space="preserve"> i el deixem buit.</w:t>
-      </w:r>
-    </w:p>
-    <w:p>
-      <w:r>
-        <w:rPr>
-          <w:b w:val="0"/>
-          <w:i w:val="0"/>
-        </w:rPr>
-        <w:t>Qualsevol de les tres em va bé; la que no em va bé és arribar al dia 2 sense haver-ho dit.</w:t>
+        <w:t xml:space="preserve"> i el deixem buit. Les tres em van bé; el que no em va bé és arribar al dia 2 sense haver-ho dit.</w:t>
       </w:r>
     </w:p>
     <w:p>
@@ -450,115 +290,12 @@
           <w:b/>
           <w:i w:val="0"/>
         </w:rPr>
-        <w:t>Les ubicacions:</w:t>
-      </w:r>
-      <w:r>
-        <w:rPr>
-          <w:b w:val="0"/>
-          <w:i w:val="0"/>
-        </w:rPr>
-        <w:t xml:space="preserve"> si encara no heu importat res a producció, el mapatge </w:t>
+        <w:t xml:space="preserve">2. El </w:t>
       </w:r>
       <w:r>
         <w:rPr>
           <w:rFonts w:ascii="Consolas" w:hAnsi="Consolas"/>
-          <w:b w:val="0"/>
-          <w:i w:val="0"/>
-          <w:color w:val="333333"/>
-          <w:sz w:val="20"/>
-        </w:rPr>
-        <w:t>id_antic → id_nou</w:t>
-      </w:r>
-      <w:r>
-        <w:rPr>
-          <w:b w:val="0"/>
-          <w:i w:val="0"/>
-        </w:rPr>
-        <w:t xml:space="preserve"> no el necessiteu i no t'empipo més. El tinc guardat; si mai fa falta, demana-me'l.</w:t>
-      </w:r>
-    </w:p>
-    <w:p>
-      <w:r>
-        <w:rPr>
           <w:b/>
-          <w:i w:val="0"/>
-        </w:rPr>
-        <w:t>La comparativa es veu millor</w:t>
-      </w:r>
-      <w:r>
-        <w:rPr>
-          <w:b w:val="0"/>
-          <w:i w:val="0"/>
-        </w:rPr>
-        <w:t xml:space="preserve"> on havia de millorar: </w:t>
-      </w:r>
-      <w:r>
-        <w:rPr>
-          <w:rFonts w:ascii="Consolas" w:hAnsi="Consolas"/>
-          <w:b w:val="0"/>
-          <w:i w:val="0"/>
-          <w:color w:val="333333"/>
-          <w:sz w:val="20"/>
-        </w:rPr>
-        <w:t>address</w:t>
-      </w:r>
-      <w:r>
-        <w:rPr>
-          <w:b w:val="0"/>
-          <w:i w:val="0"/>
-        </w:rPr>
-        <w:t xml:space="preserve"> 1.279 → 651, </w:t>
-      </w:r>
-      <w:r>
-        <w:rPr>
-          <w:rFonts w:ascii="Consolas" w:hAnsi="Consolas"/>
-          <w:b w:val="0"/>
-          <w:i w:val="0"/>
-          <w:color w:val="333333"/>
-          <w:sz w:val="20"/>
-        </w:rPr>
-        <w:t>zip_code</w:t>
-      </w:r>
-      <w:r>
-        <w:rPr>
-          <w:b w:val="0"/>
-          <w:i w:val="0"/>
-        </w:rPr>
-        <w:t xml:space="preserve"> 673 → 26, </w:t>
-      </w:r>
-      <w:r>
-        <w:rPr>
-          <w:rFonts w:ascii="Consolas" w:hAnsi="Consolas"/>
-          <w:b w:val="0"/>
-          <w:i w:val="0"/>
-          <w:color w:val="333333"/>
-          <w:sz w:val="20"/>
-        </w:rPr>
-        <w:t>city</w:t>
-      </w:r>
-      <w:r>
-        <w:rPr>
-          <w:b w:val="0"/>
-          <w:i w:val="0"/>
-        </w:rPr>
-        <w:t xml:space="preserve"> 614 → 48. Els telèfons ja vénen amb aquell format de SAP.</w:t>
-      </w:r>
-    </w:p>
-    <w:p>
-      <w:pPr>
-        <w:pStyle w:val="Heading2"/>
-      </w:pPr>
-      <w:r>
-        <w:rPr>
-          <w:b w:val="0"/>
-          <w:i w:val="0"/>
-        </w:rPr>
-        <w:t xml:space="preserve">El </w:t>
-      </w:r>
-      <w:r>
-        <w:rPr>
-          <w:rFonts w:ascii="Consolas" w:hAnsi="Consolas"/>
-          <w:b w:val="0"/>
           <w:i w:val="0"/>
           <w:color w:val="333333"/>
           <w:sz w:val="20"/>
@@ -567,86 +304,31 @@
       </w:r>
       <w:r>
         <w:rPr>
-          <w:b w:val="0"/>
+          <w:b/>
           <w:i w:val="0"/>
         </w:rPr>
-        <w:t xml:space="preserve"> no és un error</w:t>
+        <w:t xml:space="preserve"> no és un error i val més no tapar-lo.</w:t>
       </w:r>
-    </w:p>
-    <w:p>
       <w:r>
         <w:rPr>
           <w:b w:val="0"/>
           <w:i w:val="0"/>
         </w:rPr>
-        <w:t xml:space="preserve">Ho he mirat a SAP i té data: </w:t>
+        <w:t xml:space="preserve"> El 25 de setembre es va anonimitzar la còpia de test —4.631 clients, només el camp del correu— perquè de la base de proves no surtin correus cap a clients de debò. </w:t>
       </w:r>
       <w:r>
         <w:rPr>
           <w:b/>
           <w:i w:val="0"/>
         </w:rPr>
-        <w:t>el 25 de setembre es va anonimitzar la còpia de test</w:t>
+        <w:t>Quan apuntem el procés a la SAP de producció desapareix sol.</w:t>
       </w:r>
       <w:r>
         <w:rPr>
           <w:b w:val="0"/>
           <w:i w:val="0"/>
         </w:rPr>
-        <w:t xml:space="preserve"> —4.631 clients tocats, 2.253 amb el prefix i 2.378 amb el correu buidat— perquè de la base de proves no surtin correus cap a clients de debò. Només afecta el camp del correu.</w:t>
-      </w:r>
-    </w:p>
-    <w:p>
-      <w:r>
-        <w:rPr>
-          <w:b w:val="0"/>
-          <w:i w:val="0"/>
-        </w:rPr>
-        <w:t xml:space="preserve">Dues coses per si us serveixen: </w:t>
-      </w:r>
-      <w:r>
-        <w:rPr>
-          <w:b/>
-          <w:i w:val="0"/>
-        </w:rPr>
-        <w:t>no marca clients inactius</w:t>
-      </w:r>
-      <w:r>
-        <w:rPr>
-          <w:b w:val="0"/>
-          <w:i w:val="0"/>
-        </w:rPr>
-        <w:t xml:space="preserve"> (849 dels 2.305 estan actius), i a </w:t>
-      </w:r>
-      <w:r>
-        <w:rPr>
-          <w:b/>
-          <w:i w:val="0"/>
-        </w:rPr>
-        <w:t>26</w:t>
-      </w:r>
-      <w:r>
-        <w:rPr>
-          <w:b w:val="0"/>
-          <w:i w:val="0"/>
-        </w:rPr>
-        <w:t xml:space="preserve"> el correu us arriba tallat, perquè el camp té 60 caràcters heretats de KAIS i el prefix se'n menja 14.</w:t>
-      </w:r>
-    </w:p>
-    <w:p>
-      <w:r>
-        <w:rPr>
-          <w:b/>
-          <w:i w:val="0"/>
-        </w:rPr>
-        <w:t>Quan apuntem el procés a la SAP de producció desapareix sol</w:t>
-      </w:r>
-      <w:r>
-        <w:rPr>
-          <w:b w:val="0"/>
-          <w:i w:val="0"/>
-        </w:rPr>
-        <w:t xml:space="preserve">, així que et demanaria que </w:t>
+        <w:t xml:space="preserve"> Per això et demanaria que </w:t>
       </w:r>
       <w:r>
         <w:rPr>
@@ -670,19 +352,21 @@
           <w:b w:val="0"/>
           <w:i w:val="0"/>
         </w:rPr>
-        <w:t>: si algun dia el prefix hi torna a sortir, voldrà dir que algú ha carregat dades de proves a producció, i això val més veure-ho que tapar-ho.</w:t>
+        <w:t xml:space="preserve">: si algun dia hi torna a sortir, voldrà dir que algú ha carregat dades de proves a producció, i això val més veure-ho. I no, </w:t>
       </w:r>
-    </w:p>
-    <w:p>
-      <w:pPr>
-        <w:pStyle w:val="Heading2"/>
-      </w:pPr>
+      <w:r>
+        <w:rPr>
+          <w:b/>
+          <w:i w:val="0"/>
+        </w:rPr>
+        <w:t>no marca clients inactius</w:t>
+      </w:r>
       <w:r>
         <w:rPr>
           <w:b w:val="0"/>
           <w:i w:val="0"/>
         </w:rPr>
-        <w:t>Dues coses curtes</w:t>
+        <w:t>: 849 dels 2.305 estan actius.</w:t>
       </w:r>
     </w:p>
     <w:p>
@@ -691,14 +375,85 @@
           <w:b/>
           <w:i w:val="0"/>
         </w:rPr>
-        <w:t>Les claus repetides</w:t>
+        <w:t xml:space="preserve">3. El </w:t>
+      </w:r>
+      <w:r>
+        <w:rPr>
+          <w:rFonts w:ascii="Consolas" w:hAnsi="Consolas"/>
+          <w:b/>
+          <w:i w:val="0"/>
+          <w:color w:val="333333"/>
+          <w:sz w:val="20"/>
+        </w:rPr>
+        <w:t>discount</w:t>
+      </w:r>
+      <w:r>
+        <w:rPr>
+          <w:b/>
+          <w:i w:val="0"/>
+        </w:rPr>
+        <w:t>.</w:t>
       </w:r>
       <w:r>
         <w:rPr>
           <w:b w:val="0"/>
           <w:i w:val="0"/>
         </w:rPr>
-        <w:t xml:space="preserve"> no poden passar a la nostra banda: </w:t>
+        <w:t xml:space="preserve"> Al teu llistat no hi surt, i entenc que mantens el teu </w:t>
+      </w:r>
+      <w:r>
+        <w:rPr>
+          <w:rFonts w:ascii="Consolas" w:hAnsi="Consolas"/>
+          <w:b w:val="0"/>
+          <w:i w:val="0"/>
+          <w:color w:val="333333"/>
+          <w:sz w:val="20"/>
+        </w:rPr>
+        <w:t>1 - discount</w:t>
+      </w:r>
+      <w:r>
+        <w:rPr>
+          <w:b w:val="0"/>
+          <w:i w:val="0"/>
+        </w:rPr>
+        <w:t xml:space="preserve"> i que seguim enviant-vos el multiplicador de KAIS. </w:t>
+      </w:r>
+      <w:r>
+        <w:rPr>
+          <w:b/>
+          <w:i w:val="0"/>
+        </w:rPr>
+        <w:t>No ho tocarem si no m'ho dius</w:t>
+      </w:r>
+      <w:r>
+        <w:rPr>
+          <w:b w:val="0"/>
+          <w:i w:val="0"/>
+        </w:rPr>
+        <w:t>: si el canviéssim nosaltres i tu el mantinguessis, els imports et sortirien a zero.</w:t>
+      </w:r>
+    </w:p>
+    <w:p>
+      <w:r>
+        <w:rPr>
+          <w:b w:val="0"/>
+          <w:i w:val="0"/>
+        </w:rPr>
+        <w:t xml:space="preserve">Dues notes curtes. Les </w:t>
+      </w:r>
+      <w:r>
+        <w:rPr>
+          <w:b/>
+          <w:i w:val="0"/>
+        </w:rPr>
+        <w:t>claus repetides</w:t>
+      </w:r>
+      <w:r>
+        <w:rPr>
+          <w:b w:val="0"/>
+          <w:i w:val="0"/>
+        </w:rPr>
+        <w:t xml:space="preserve"> no poden passar a la nostra banda, perquè </w:t>
       </w:r>
       <w:r>
         <w:rPr>
@@ -715,23 +470,7 @@
           <w:b w:val="0"/>
           <w:i w:val="0"/>
         </w:rPr>
-        <w:t xml:space="preserve"> és clau primària, i un duplicat faria fallar la càrrega en comptes de deixar-te dues files.</w:t>
-      </w:r>
-    </w:p>
-    <w:p>
-      <w:r>
-        <w:rPr>
-          <w:b/>
-          <w:i w:val="0"/>
-        </w:rPr>
-        <w:t>I una pregunta que ve d'aquí</w:t>
-      </w:r>
-      <w:r>
-        <w:rPr>
-          <w:b w:val="0"/>
-          <w:i w:val="0"/>
-        </w:rPr>
-        <w:t xml:space="preserve">, millor ara que el dia 2: el nostre </w:t>
+        <w:t xml:space="preserve"> és clau primària: un duplicat faria fallar la càrrega. Però d'aquí surt una pregunta, millor ara que el dia 2: el nostre </w:t>
       </w:r>
       <w:r>
         <w:rPr>
@@ -779,7 +518,7 @@
           <w:b w:val="0"/>
           <w:i w:val="0"/>
         </w:rPr>
-        <w:t xml:space="preserve">. Un document de </w:t>
+        <w:t xml:space="preserve">. Teniu documents de </w:t>
       </w:r>
       <w:r>
         <w:rPr>
@@ -793,23 +532,30 @@
           <w:b w:val="0"/>
           <w:i w:val="0"/>
         </w:rPr>
-        <w:t xml:space="preserve"> no hi cabria. Al vostre històric n'hi ha? Si em dius que sí, acordem el format nou abans del tall.</w:t>
+        <w:t>? Si em dius que sí, acordem el format nou abans del tall.</w:t>
       </w:r>
     </w:p>
     <w:p>
       <w:r>
         <w:rPr>
+          <w:b w:val="0"/>
+          <w:i w:val="0"/>
+        </w:rPr>
+        <w:t xml:space="preserve">I dels </w:t>
+      </w:r>
+      <w:r>
+        <w:rPr>
           <w:b/>
           <w:i w:val="0"/>
         </w:rPr>
-        <w:t>Els accents:</w:t>
+        <w:t>accents</w:t>
       </w:r>
       <w:r>
         <w:rPr>
           <w:b w:val="0"/>
           <w:i w:val="0"/>
         </w:rPr>
-        <w:t xml:space="preserve"> gràcies per trobar-ho, jo t'havia apuntat cap a la codificació del fitxer i era el </w:t>
+        <w:t xml:space="preserve">, gràcies per trobar-ho: jo t'havia apuntat cap a la codificació del fitxer i era el </w:t>
       </w:r>
       <w:r>
         <w:rPr>
@@ -847,24 +593,26 @@
       </w:r>
     </w:p>
     <w:p>
-      <w:pPr>
-        <w:pStyle w:val="Heading2"/>
-      </w:pPr>
       <w:r>
         <w:rPr>
           <w:b w:val="0"/>
           <w:i w:val="0"/>
         </w:rPr>
-        <w:t>Magatzem i previsions (per a en Lluís)</w:t>
+        <w:t xml:space="preserve">De </w:t>
       </w:r>
-    </w:p>
-    <w:p>
+      <w:r>
+        <w:rPr>
+          <w:b/>
+          <w:i w:val="0"/>
+        </w:rPr>
+        <w:t>magatzem i previsions</w:t>
+      </w:r>
       <w:r>
         <w:rPr>
           <w:b w:val="0"/>
           <w:i w:val="0"/>
         </w:rPr>
-        <w:t xml:space="preserve">És l'únic que em queda del correu anterior. A SAP el magatzem no és una dada de l'article sinó de </w:t>
+        <w:t xml:space="preserve"> per a en Lluís encara no em dius res. A SAP el magatzem no és una dada de l'article sinó de </w:t>
       </w:r>
       <w:r>
         <w:rPr>
@@ -878,38 +626,7 @@
           <w:b w:val="0"/>
           <w:i w:val="0"/>
         </w:rPr>
-        <w:t xml:space="preserve">; avui no us el portem i afegir-lo és una columna nova a </w:t>
-      </w:r>
-      <w:r>
-        <w:rPr>
-          <w:rFonts w:ascii="Consolas" w:hAnsi="Consolas"/>
-          <w:b w:val="0"/>
-          <w:i w:val="0"/>
-          <w:color w:val="333333"/>
-          <w:sz w:val="20"/>
-        </w:rPr>
-        <w:t>est_linies_albara</w:t>
-      </w:r>
-      <w:r>
-        <w:rPr>
-          <w:b w:val="0"/>
-          <w:i w:val="0"/>
-        </w:rPr>
-        <w:t xml:space="preserve">, que és contracte: digue'm nom i format. Compta que la sèrie començaria el 2 de novembre, perquè la SAP de producció arrenca sense històric documental. I de </w:t>
-      </w:r>
-      <w:r>
-        <w:rPr>
-          <w:b/>
-          <w:i w:val="0"/>
-        </w:rPr>
-        <w:t>previsions</w:t>
-      </w:r>
-      <w:r>
-        <w:rPr>
-          <w:b w:val="0"/>
-          <w:i w:val="0"/>
-        </w:rPr>
-        <w:t xml:space="preserve"> no n'hi ha res a la guia d'importació: què fa Analitza CM amb una previsió i quines dades demana?</w:t>
+        <w:t>: avui no us el portem i afegir-lo és una columna nova, que és contracte — digue'm nom i format, i compta que la sèrie començaria el 2 de novembre perquè la SAP de producció arrenca sense històric. I de previsions, què demana Analitza CM com a dades d'entrada?</w:t>
       </w:r>
     </w:p>
     <w:p>

</xml_diff>